<commit_message>
Add Week01 Lecture and Note
</commit_message>
<xml_diff>
--- a/Modules/Week01 - Introduction/Brief Introduction.docx
+++ b/Modules/Week01 - Introduction/Brief Introduction.docx
@@ -18,6 +18,8 @@
           <w:lang w:val="en-US"/>
         </w:rPr>
       </w:pPr>
+      <w:bookmarkStart w:id="0" w:name="_GoBack"/>
+      <w:bookmarkEnd w:id="0"/>
       <w:r>
         <w:rPr>
           <w:rFonts w:hint="default" w:ascii="Times New Roman" w:hAnsi="Times New Roman" w:cs="Times New Roman"/>
@@ -656,9 +658,13 @@
           <w:szCs w:val="24"/>
           <w:lang w:val="en-US"/>
         </w:rPr>
-      </w:pPr>
-      <w:bookmarkStart w:id="0" w:name="_GoBack"/>
-      <w:bookmarkEnd w:id="0"/>
+        <w:sectPr>
+          <w:pgSz w:w="16838" w:h="11906" w:orient="landscape"/>
+          <w:pgMar w:top="1800" w:right="1440" w:bottom="1800" w:left="1440" w:header="720" w:footer="720" w:gutter="0"/>
+          <w:cols w:space="720" w:num="1"/>
+          <w:docGrid w:linePitch="360" w:charSpace="0"/>
+        </w:sectPr>
+      </w:pPr>
       <w:r>
         <w:rPr>
           <w:rFonts w:hint="default" w:ascii="SimSun" w:hAnsi="SimSun" w:eastAsia="SimSun" w:cs="SimSun"/>
@@ -673,7 +679,7 @@
               <wp:posOffset>-140335</wp:posOffset>
             </wp:positionH>
             <wp:positionV relativeFrom="paragraph">
-              <wp:posOffset>91440</wp:posOffset>
+              <wp:posOffset>367030</wp:posOffset>
             </wp:positionV>
             <wp:extent cx="9144635" cy="4987925"/>
             <wp:effectExtent l="0" t="0" r="14605" b="10795"/>
@@ -713,9 +719,1089 @@
         </w:drawing>
       </w:r>
     </w:p>
+    <w:p>
+      <w:pPr>
+        <w:pStyle w:val="4"/>
+        <w:keepNext w:val="0"/>
+        <w:keepLines w:val="0"/>
+        <w:widowControl/>
+        <w:numPr>
+          <w:ilvl w:val="0"/>
+          <w:numId w:val="7"/>
+        </w:numPr>
+        <w:suppressLineNumbers w:val="0"/>
+        <w:ind w:left="420" w:leftChars="0" w:hanging="420" w:firstLineChars="0"/>
+        <w:rPr>
+          <w:b/>
+          <w:bCs/>
+          <w:sz w:val="28"/>
+          <w:szCs w:val="28"/>
+        </w:rPr>
+      </w:pPr>
+      <w:r>
+        <w:rPr>
+          <w:b/>
+          <w:bCs/>
+          <w:sz w:val="28"/>
+          <w:szCs w:val="28"/>
+        </w:rPr>
+        <w:t>Overview of Machine Learning Visual Inspection:</w:t>
+      </w:r>
+    </w:p>
+    <w:p>
+      <w:pPr>
+        <w:pStyle w:val="4"/>
+        <w:keepNext w:val="0"/>
+        <w:keepLines w:val="0"/>
+        <w:widowControl/>
+        <w:numPr>
+          <w:ilvl w:val="0"/>
+          <w:numId w:val="8"/>
+        </w:numPr>
+        <w:suppressLineNumbers w:val="0"/>
+        <w:tabs>
+          <w:tab w:val="clear" w:pos="420"/>
+        </w:tabs>
+        <w:ind w:left="800" w:leftChars="0" w:hanging="420" w:firstLineChars="0"/>
+        <w:jc w:val="both"/>
+        <w:rPr>
+          <w:sz w:val="25"/>
+          <w:szCs w:val="25"/>
+        </w:rPr>
+      </w:pPr>
+      <w:r>
+        <w:rPr>
+          <w:sz w:val="25"/>
+          <w:szCs w:val="25"/>
+        </w:rPr>
+        <w:t>This technology is used for defect and mismatch assessment.</w:t>
+      </w:r>
+    </w:p>
+    <w:p>
+      <w:pPr>
+        <w:pStyle w:val="4"/>
+        <w:keepNext w:val="0"/>
+        <w:keepLines w:val="0"/>
+        <w:widowControl/>
+        <w:numPr>
+          <w:ilvl w:val="0"/>
+          <w:numId w:val="8"/>
+        </w:numPr>
+        <w:suppressLineNumbers w:val="0"/>
+        <w:tabs>
+          <w:tab w:val="clear" w:pos="420"/>
+        </w:tabs>
+        <w:ind w:left="800" w:leftChars="0" w:hanging="420" w:firstLineChars="0"/>
+        <w:jc w:val="both"/>
+        <w:rPr>
+          <w:b/>
+          <w:bCs/>
+          <w:sz w:val="25"/>
+          <w:szCs w:val="25"/>
+        </w:rPr>
+      </w:pPr>
+      <w:r>
+        <w:rPr>
+          <w:sz w:val="25"/>
+          <w:szCs w:val="25"/>
+        </w:rPr>
+        <w:t xml:space="preserve">It is widely applied across various industries such as </w:t>
+      </w:r>
+      <w:r>
+        <w:rPr>
+          <w:b/>
+          <w:bCs/>
+          <w:sz w:val="25"/>
+          <w:szCs w:val="25"/>
+        </w:rPr>
+        <w:t>retail, manufacturing, airport baggage screening, the food industry, and medicine</w:t>
+      </w:r>
+      <w:r>
+        <w:rPr>
+          <w:sz w:val="25"/>
+          <w:szCs w:val="25"/>
+        </w:rPr>
+        <w:t>.</w:t>
+      </w:r>
+    </w:p>
+    <w:p>
+      <w:pPr>
+        <w:pStyle w:val="4"/>
+        <w:keepNext w:val="0"/>
+        <w:keepLines w:val="0"/>
+        <w:widowControl/>
+        <w:numPr>
+          <w:ilvl w:val="0"/>
+          <w:numId w:val="7"/>
+        </w:numPr>
+        <w:suppressLineNumbers w:val="0"/>
+        <w:ind w:left="420" w:leftChars="0" w:hanging="420" w:firstLineChars="0"/>
+        <w:rPr>
+          <w:b/>
+          <w:bCs/>
+          <w:sz w:val="28"/>
+          <w:szCs w:val="28"/>
+        </w:rPr>
+      </w:pPr>
+      <w:r>
+        <w:rPr>
+          <w:b/>
+          <w:bCs/>
+          <w:sz w:val="28"/>
+          <w:szCs w:val="28"/>
+        </w:rPr>
+        <w:t>How the System Works:</w:t>
+      </w:r>
+    </w:p>
+    <w:p>
+      <w:pPr>
+        <w:pStyle w:val="4"/>
+        <w:keepNext w:val="0"/>
+        <w:keepLines w:val="0"/>
+        <w:widowControl/>
+        <w:numPr>
+          <w:ilvl w:val="0"/>
+          <w:numId w:val="9"/>
+        </w:numPr>
+        <w:suppressLineNumbers w:val="0"/>
+        <w:tabs>
+          <w:tab w:val="clear" w:pos="425"/>
+        </w:tabs>
+        <w:ind w:left="800" w:leftChars="0" w:hanging="425" w:firstLineChars="0"/>
+        <w:jc w:val="both"/>
+        <w:rPr>
+          <w:b w:val="0"/>
+          <w:bCs w:val="0"/>
+        </w:rPr>
+      </w:pPr>
+      <w:r>
+        <w:rPr>
+          <w:b w:val="0"/>
+          <w:bCs w:val="0"/>
+        </w:rPr>
+        <w:t>Image processing: Images are captured using cameras from the production line.</w:t>
+      </w:r>
+    </w:p>
+    <w:p>
+      <w:pPr>
+        <w:pStyle w:val="4"/>
+        <w:keepNext w:val="0"/>
+        <w:keepLines w:val="0"/>
+        <w:widowControl/>
+        <w:numPr>
+          <w:ilvl w:val="0"/>
+          <w:numId w:val="9"/>
+        </w:numPr>
+        <w:suppressLineNumbers w:val="0"/>
+        <w:tabs>
+          <w:tab w:val="clear" w:pos="425"/>
+        </w:tabs>
+        <w:ind w:left="800" w:leftChars="0" w:hanging="425" w:firstLineChars="0"/>
+        <w:jc w:val="both"/>
+        <w:rPr>
+          <w:b w:val="0"/>
+          <w:bCs w:val="0"/>
+        </w:rPr>
+      </w:pPr>
+      <w:r>
+        <w:rPr>
+          <w:b w:val="0"/>
+          <w:bCs w:val="0"/>
+        </w:rPr>
+        <w:t>Feature extraction: The images are passed through a neural network to recognize features.</w:t>
+      </w:r>
+    </w:p>
+    <w:p>
+      <w:pPr>
+        <w:pStyle w:val="4"/>
+        <w:keepNext w:val="0"/>
+        <w:keepLines w:val="0"/>
+        <w:widowControl/>
+        <w:numPr>
+          <w:ilvl w:val="0"/>
+          <w:numId w:val="9"/>
+        </w:numPr>
+        <w:suppressLineNumbers w:val="0"/>
+        <w:tabs>
+          <w:tab w:val="clear" w:pos="425"/>
+        </w:tabs>
+        <w:ind w:left="800" w:leftChars="0" w:hanging="425" w:firstLineChars="0"/>
+        <w:jc w:val="both"/>
+        <w:rPr>
+          <w:b w:val="0"/>
+          <w:bCs w:val="0"/>
+        </w:rPr>
+      </w:pPr>
+      <w:r>
+        <w:rPr>
+          <w:b w:val="0"/>
+          <w:bCs w:val="0"/>
+        </w:rPr>
+        <w:t>Detection and classification: The network localizes and identifies the position of defects or anomalies.</w:t>
+      </w:r>
+    </w:p>
+    <w:p>
+      <w:pPr>
+        <w:pStyle w:val="4"/>
+        <w:keepNext w:val="0"/>
+        <w:keepLines w:val="0"/>
+        <w:widowControl/>
+        <w:numPr>
+          <w:ilvl w:val="0"/>
+          <w:numId w:val="9"/>
+        </w:numPr>
+        <w:suppressLineNumbers w:val="0"/>
+        <w:tabs>
+          <w:tab w:val="clear" w:pos="425"/>
+        </w:tabs>
+        <w:ind w:left="800" w:leftChars="0" w:hanging="425" w:firstLineChars="0"/>
+        <w:jc w:val="both"/>
+        <w:rPr>
+          <w:b w:val="0"/>
+          <w:bCs w:val="0"/>
+          <w:sz w:val="28"/>
+          <w:szCs w:val="28"/>
+        </w:rPr>
+      </w:pPr>
+      <w:r>
+        <w:rPr>
+          <w:b w:val="0"/>
+          <w:bCs w:val="0"/>
+        </w:rPr>
+        <w:t>Final decision: Once the system confidently identifies an issue, it performs predefined actions (such as sending an alert or rejecting a defective product).</w:t>
+      </w:r>
+    </w:p>
+    <w:p>
+      <w:pPr>
+        <w:pStyle w:val="4"/>
+        <w:keepNext w:val="0"/>
+        <w:keepLines w:val="0"/>
+        <w:widowControl/>
+        <w:numPr>
+          <w:ilvl w:val="0"/>
+          <w:numId w:val="7"/>
+        </w:numPr>
+        <w:suppressLineNumbers w:val="0"/>
+        <w:ind w:left="420" w:leftChars="0" w:hanging="420" w:firstLineChars="0"/>
+        <w:rPr>
+          <w:b/>
+          <w:bCs/>
+          <w:sz w:val="28"/>
+          <w:szCs w:val="28"/>
+        </w:rPr>
+      </w:pPr>
+      <w:r>
+        <w:rPr>
+          <w:b/>
+          <w:bCs/>
+          <w:sz w:val="28"/>
+          <w:szCs w:val="28"/>
+        </w:rPr>
+        <w:t>Real-World Business Examples:</w:t>
+      </w:r>
+    </w:p>
+    <w:p>
+      <w:pPr>
+        <w:pStyle w:val="4"/>
+        <w:keepNext w:val="0"/>
+        <w:keepLines w:val="0"/>
+        <w:widowControl/>
+        <w:numPr>
+          <w:ilvl w:val="0"/>
+          <w:numId w:val="10"/>
+        </w:numPr>
+        <w:suppressLineNumbers w:val="0"/>
+        <w:tabs>
+          <w:tab w:val="clear" w:pos="420"/>
+        </w:tabs>
+        <w:ind w:left="800" w:leftChars="0" w:hanging="420" w:firstLineChars="0"/>
+        <w:jc w:val="both"/>
+      </w:pPr>
+      <w:r>
+        <w:rPr>
+          <w:b/>
+          <w:bCs/>
+        </w:rPr>
+        <w:t>Sunflower oil production line:</w:t>
+      </w:r>
+      <w:r>
+        <w:t xml:space="preserve"> Detects cracked bottles or missing barcodes on the conveyor belt in real-time to remove them before packaging.</w:t>
+      </w:r>
+    </w:p>
+    <w:p>
+      <w:pPr>
+        <w:pStyle w:val="4"/>
+        <w:keepNext w:val="0"/>
+        <w:keepLines w:val="0"/>
+        <w:widowControl/>
+        <w:numPr>
+          <w:ilvl w:val="0"/>
+          <w:numId w:val="10"/>
+        </w:numPr>
+        <w:suppressLineNumbers w:val="0"/>
+        <w:tabs>
+          <w:tab w:val="clear" w:pos="420"/>
+        </w:tabs>
+        <w:ind w:left="800" w:leftChars="0" w:hanging="420" w:firstLineChars="0"/>
+        <w:jc w:val="both"/>
+        <w:rPr>
+          <w:b/>
+          <w:bCs/>
+          <w:sz w:val="28"/>
+          <w:szCs w:val="28"/>
+        </w:rPr>
+      </w:pPr>
+      <w:r>
+        <w:rPr>
+          <w:b/>
+          <w:bCs/>
+        </w:rPr>
+        <w:t>Factory worker safety:</w:t>
+      </w:r>
+      <w:r>
+        <w:t xml:space="preserve"> Uses workplace surveillance cameras to detect whether workers are complying with protective gear regulations (such as wearing helmets, gloves, and safety shoes).</w:t>
+      </w:r>
+    </w:p>
+    <w:p>
+      <w:pPr>
+        <w:pStyle w:val="4"/>
+        <w:keepNext w:val="0"/>
+        <w:keepLines w:val="0"/>
+        <w:widowControl/>
+        <w:numPr>
+          <w:ilvl w:val="0"/>
+          <w:numId w:val="7"/>
+        </w:numPr>
+        <w:suppressLineNumbers w:val="0"/>
+        <w:ind w:left="420" w:leftChars="0" w:hanging="420" w:firstLineChars="0"/>
+        <w:rPr>
+          <w:b/>
+          <w:bCs/>
+          <w:sz w:val="28"/>
+          <w:szCs w:val="28"/>
+        </w:rPr>
+      </w:pPr>
+      <w:r>
+        <w:rPr>
+          <w:b/>
+          <w:bCs/>
+          <w:sz w:val="28"/>
+          <w:szCs w:val="28"/>
+        </w:rPr>
+        <w:t>Requirements for Implementation:</w:t>
+      </w:r>
+    </w:p>
+    <w:p>
+      <w:pPr>
+        <w:pStyle w:val="4"/>
+        <w:keepNext w:val="0"/>
+        <w:keepLines w:val="0"/>
+        <w:widowControl/>
+        <w:numPr>
+          <w:ilvl w:val="0"/>
+          <w:numId w:val="11"/>
+        </w:numPr>
+        <w:suppressLineNumbers w:val="0"/>
+        <w:tabs>
+          <w:tab w:val="clear" w:pos="420"/>
+        </w:tabs>
+        <w:ind w:left="800" w:leftChars="0" w:hanging="420" w:firstLineChars="0"/>
+        <w:jc w:val="both"/>
+        <w:rPr>
+          <w:sz w:val="25"/>
+          <w:szCs w:val="25"/>
+        </w:rPr>
+      </w:pPr>
+      <w:r>
+        <w:rPr>
+          <w:sz w:val="25"/>
+          <w:szCs w:val="25"/>
+        </w:rPr>
+        <w:t xml:space="preserve">Requires an </w:t>
+      </w:r>
+      <w:r>
+        <w:rPr>
+          <w:b/>
+          <w:bCs/>
+          <w:sz w:val="25"/>
+          <w:szCs w:val="25"/>
+        </w:rPr>
+        <w:t>accurately trained neural network</w:t>
+      </w:r>
+      <w:r>
+        <w:rPr>
+          <w:sz w:val="25"/>
+          <w:szCs w:val="25"/>
+        </w:rPr>
+        <w:t xml:space="preserve"> to ensure high precision for the quality management system.</w:t>
+      </w:r>
+    </w:p>
+    <w:p>
+      <w:pPr>
+        <w:pStyle w:val="4"/>
+        <w:keepNext w:val="0"/>
+        <w:keepLines w:val="0"/>
+        <w:widowControl/>
+        <w:numPr>
+          <w:ilvl w:val="0"/>
+          <w:numId w:val="11"/>
+        </w:numPr>
+        <w:suppressLineNumbers w:val="0"/>
+        <w:tabs>
+          <w:tab w:val="clear" w:pos="420"/>
+        </w:tabs>
+        <w:ind w:left="800" w:leftChars="0" w:hanging="420" w:firstLineChars="0"/>
+        <w:jc w:val="both"/>
+        <w:rPr>
+          <w:sz w:val="25"/>
+          <w:szCs w:val="25"/>
+        </w:rPr>
+      </w:pPr>
+      <w:r>
+        <w:rPr>
+          <w:sz w:val="25"/>
+          <w:szCs w:val="25"/>
+        </w:rPr>
+        <w:t>Requires a clearly defined problem to select the appropriate network architecture (e.g., image classification, object detection, or semantic segmentation) depending on the level of detail needed for defect inspection.</w:t>
+      </w:r>
+    </w:p>
+    <w:p>
+      <w:pPr>
+        <w:pStyle w:val="4"/>
+        <w:keepNext w:val="0"/>
+        <w:keepLines w:val="0"/>
+        <w:widowControl/>
+        <w:numPr>
+          <w:numId w:val="0"/>
+        </w:numPr>
+        <w:suppressLineNumbers w:val="0"/>
+        <w:ind w:leftChars="0" w:right="0" w:rightChars="0"/>
+        <w:rPr>
+          <w:b/>
+          <w:bCs/>
+          <w:sz w:val="28"/>
+          <w:szCs w:val="28"/>
+        </w:rPr>
+      </w:pPr>
+    </w:p>
+    <w:p>
+      <w:pPr>
+        <w:pStyle w:val="4"/>
+        <w:keepNext w:val="0"/>
+        <w:keepLines w:val="0"/>
+        <w:widowControl/>
+        <w:numPr>
+          <w:numId w:val="0"/>
+        </w:numPr>
+        <w:suppressLineNumbers w:val="0"/>
+        <w:ind w:leftChars="0" w:right="0" w:rightChars="0"/>
+        <w:rPr>
+          <w:b/>
+          <w:bCs/>
+          <w:sz w:val="28"/>
+          <w:szCs w:val="28"/>
+        </w:rPr>
+      </w:pPr>
+    </w:p>
+    <w:p>
+      <w:pPr>
+        <w:pStyle w:val="4"/>
+        <w:keepNext w:val="0"/>
+        <w:keepLines w:val="0"/>
+        <w:widowControl/>
+        <w:numPr>
+          <w:numId w:val="0"/>
+        </w:numPr>
+        <w:suppressLineNumbers w:val="0"/>
+        <w:ind w:leftChars="0" w:right="0" w:rightChars="0"/>
+        <w:rPr>
+          <w:b/>
+          <w:bCs/>
+          <w:sz w:val="28"/>
+          <w:szCs w:val="28"/>
+        </w:rPr>
+      </w:pPr>
+    </w:p>
+    <w:p>
+      <w:pPr>
+        <w:pStyle w:val="4"/>
+        <w:keepNext w:val="0"/>
+        <w:keepLines w:val="0"/>
+        <w:widowControl/>
+        <w:numPr>
+          <w:numId w:val="0"/>
+        </w:numPr>
+        <w:suppressLineNumbers w:val="0"/>
+        <w:ind w:leftChars="0" w:right="0" w:rightChars="0"/>
+        <w:rPr>
+          <w:b/>
+          <w:bCs/>
+          <w:sz w:val="28"/>
+          <w:szCs w:val="28"/>
+        </w:rPr>
+      </w:pPr>
+    </w:p>
+    <w:p>
+      <w:pPr>
+        <w:pStyle w:val="4"/>
+        <w:keepNext w:val="0"/>
+        <w:keepLines w:val="0"/>
+        <w:widowControl/>
+        <w:numPr>
+          <w:numId w:val="0"/>
+        </w:numPr>
+        <w:suppressLineNumbers w:val="0"/>
+        <w:ind w:leftChars="0" w:right="0" w:rightChars="0"/>
+        <w:rPr>
+          <w:b/>
+          <w:bCs/>
+          <w:sz w:val="28"/>
+          <w:szCs w:val="28"/>
+        </w:rPr>
+      </w:pPr>
+    </w:p>
+    <w:p>
+      <w:pPr>
+        <w:pStyle w:val="4"/>
+        <w:keepNext w:val="0"/>
+        <w:keepLines w:val="0"/>
+        <w:widowControl/>
+        <w:numPr>
+          <w:numId w:val="0"/>
+        </w:numPr>
+        <w:suppressLineNumbers w:val="0"/>
+        <w:ind w:leftChars="0" w:right="0" w:rightChars="0"/>
+        <w:rPr>
+          <w:b/>
+          <w:bCs/>
+          <w:sz w:val="28"/>
+          <w:szCs w:val="28"/>
+        </w:rPr>
+      </w:pPr>
+    </w:p>
+    <w:p>
+      <w:pPr>
+        <w:pStyle w:val="4"/>
+        <w:keepNext w:val="0"/>
+        <w:keepLines w:val="0"/>
+        <w:widowControl/>
+        <w:numPr>
+          <w:ilvl w:val="0"/>
+          <w:numId w:val="12"/>
+        </w:numPr>
+        <w:suppressLineNumbers w:val="0"/>
+        <w:ind w:left="420" w:leftChars="0" w:hanging="420" w:firstLineChars="0"/>
+        <w:rPr>
+          <w:sz w:val="28"/>
+          <w:szCs w:val="28"/>
+        </w:rPr>
+      </w:pPr>
+      <w:r>
+        <w:rPr>
+          <w:b/>
+          <w:bCs/>
+          <w:sz w:val="28"/>
+          <w:szCs w:val="28"/>
+        </w:rPr>
+        <w:t>Traditional Rule-Based Machine Vision:</w:t>
+      </w:r>
+    </w:p>
+    <w:p>
+      <w:pPr>
+        <w:pStyle w:val="4"/>
+        <w:keepNext w:val="0"/>
+        <w:keepLines w:val="0"/>
+        <w:widowControl/>
+        <w:numPr>
+          <w:ilvl w:val="0"/>
+          <w:numId w:val="13"/>
+        </w:numPr>
+        <w:suppressLineNumbers w:val="0"/>
+        <w:tabs>
+          <w:tab w:val="left" w:pos="400"/>
+          <w:tab w:val="clear" w:pos="420"/>
+        </w:tabs>
+        <w:ind w:left="800" w:leftChars="0" w:hanging="420" w:firstLineChars="0"/>
+        <w:jc w:val="both"/>
+        <w:rPr>
+          <w:sz w:val="25"/>
+          <w:szCs w:val="25"/>
+        </w:rPr>
+      </w:pPr>
+      <w:r>
+        <w:rPr>
+          <w:b/>
+          <w:bCs/>
+          <w:sz w:val="25"/>
+          <w:szCs w:val="25"/>
+        </w:rPr>
+        <w:t>Characteristics:</w:t>
+      </w:r>
+      <w:r>
+        <w:rPr>
+          <w:sz w:val="25"/>
+          <w:szCs w:val="25"/>
+        </w:rPr>
+        <w:t xml:space="preserve"> Operates very reliably with consistent, well-manufactured parts and excels in high-precision applications.</w:t>
+      </w:r>
+    </w:p>
+    <w:p>
+      <w:pPr>
+        <w:pStyle w:val="4"/>
+        <w:keepNext w:val="0"/>
+        <w:keepLines w:val="0"/>
+        <w:widowControl/>
+        <w:numPr>
+          <w:ilvl w:val="0"/>
+          <w:numId w:val="13"/>
+        </w:numPr>
+        <w:suppressLineNumbers w:val="0"/>
+        <w:tabs>
+          <w:tab w:val="left" w:pos="400"/>
+          <w:tab w:val="clear" w:pos="420"/>
+        </w:tabs>
+        <w:ind w:left="800" w:leftChars="0" w:hanging="420" w:firstLineChars="0"/>
+        <w:jc w:val="both"/>
+        <w:rPr>
+          <w:sz w:val="25"/>
+          <w:szCs w:val="25"/>
+        </w:rPr>
+      </w:pPr>
+      <w:r>
+        <w:rPr>
+          <w:b/>
+          <w:bCs/>
+          <w:sz w:val="25"/>
+          <w:szCs w:val="25"/>
+        </w:rPr>
+        <w:t>Main Functions:</w:t>
+      </w:r>
+      <w:r>
+        <w:rPr>
+          <w:sz w:val="25"/>
+          <w:szCs w:val="25"/>
+        </w:rPr>
+        <w:t xml:space="preserve"> Guidance, identification, gauging, and inspection, executed at extremely fast speeds with high accuracy.</w:t>
+      </w:r>
+    </w:p>
+    <w:p>
+      <w:pPr>
+        <w:pStyle w:val="4"/>
+        <w:keepNext w:val="0"/>
+        <w:keepLines w:val="0"/>
+        <w:widowControl/>
+        <w:numPr>
+          <w:ilvl w:val="0"/>
+          <w:numId w:val="13"/>
+        </w:numPr>
+        <w:suppressLineNumbers w:val="0"/>
+        <w:tabs>
+          <w:tab w:val="left" w:pos="400"/>
+          <w:tab w:val="clear" w:pos="420"/>
+        </w:tabs>
+        <w:ind w:left="800" w:leftChars="0" w:hanging="420" w:firstLineChars="0"/>
+        <w:jc w:val="both"/>
+        <w:rPr>
+          <w:sz w:val="25"/>
+          <w:szCs w:val="25"/>
+        </w:rPr>
+      </w:pPr>
+      <w:r>
+        <w:rPr>
+          <w:b/>
+          <w:bCs/>
+          <w:sz w:val="25"/>
+          <w:szCs w:val="25"/>
+        </w:rPr>
+        <w:t>Advantages:</w:t>
+      </w:r>
+      <w:r>
+        <w:rPr>
+          <w:sz w:val="25"/>
+          <w:szCs w:val="25"/>
+        </w:rPr>
+        <w:t xml:space="preserve"> Great when variables are well understood—such as checking if a part is present/absent, verifying shape and size, or determining where a robot needs to place a part in a controlled environment.</w:t>
+      </w:r>
+    </w:p>
+    <w:p>
+      <w:pPr>
+        <w:pStyle w:val="4"/>
+        <w:keepNext w:val="0"/>
+        <w:keepLines w:val="0"/>
+        <w:widowControl/>
+        <w:numPr>
+          <w:ilvl w:val="0"/>
+          <w:numId w:val="13"/>
+        </w:numPr>
+        <w:suppressLineNumbers w:val="0"/>
+        <w:tabs>
+          <w:tab w:val="left" w:pos="400"/>
+          <w:tab w:val="clear" w:pos="420"/>
+        </w:tabs>
+        <w:ind w:left="800" w:leftChars="0" w:hanging="420" w:firstLineChars="0"/>
+        <w:jc w:val="both"/>
+        <w:rPr>
+          <w:sz w:val="25"/>
+          <w:szCs w:val="25"/>
+        </w:rPr>
+      </w:pPr>
+      <w:r>
+        <w:rPr>
+          <w:b/>
+          <w:bCs/>
+          <w:sz w:val="25"/>
+          <w:szCs w:val="25"/>
+        </w:rPr>
+        <w:t>Limitations:</w:t>
+      </w:r>
+      <w:r>
+        <w:rPr>
+          <w:sz w:val="25"/>
+          <w:szCs w:val="25"/>
+        </w:rPr>
+        <w:t xml:space="preserve"> Struggles with complex, unclear situations like checking for tears or scratches on packages where no two defects look alike. Writing rules-based code for all unexpected variables requires immense effort.</w:t>
+      </w:r>
+    </w:p>
+    <w:p>
+      <w:pPr>
+        <w:pStyle w:val="4"/>
+        <w:keepNext w:val="0"/>
+        <w:keepLines w:val="0"/>
+        <w:widowControl/>
+        <w:numPr>
+          <w:ilvl w:val="0"/>
+          <w:numId w:val="12"/>
+        </w:numPr>
+        <w:suppressLineNumbers w:val="0"/>
+        <w:ind w:left="420" w:leftChars="0" w:hanging="420" w:firstLineChars="0"/>
+        <w:rPr>
+          <w:sz w:val="28"/>
+          <w:szCs w:val="28"/>
+        </w:rPr>
+      </w:pPr>
+      <w:r>
+        <w:rPr>
+          <w:b/>
+          <w:bCs/>
+          <w:sz w:val="28"/>
+          <w:szCs w:val="28"/>
+        </w:rPr>
+        <w:t>Deep Learning in Machine Vision:</w:t>
+      </w:r>
+    </w:p>
+    <w:p>
+      <w:pPr>
+        <w:pStyle w:val="4"/>
+        <w:keepNext w:val="0"/>
+        <w:keepLines w:val="0"/>
+        <w:widowControl/>
+        <w:numPr>
+          <w:ilvl w:val="0"/>
+          <w:numId w:val="14"/>
+        </w:numPr>
+        <w:suppressLineNumbers w:val="0"/>
+        <w:tabs>
+          <w:tab w:val="clear" w:pos="420"/>
+        </w:tabs>
+        <w:ind w:left="800" w:leftChars="0" w:hanging="420" w:firstLineChars="0"/>
+        <w:jc w:val="both"/>
+        <w:rPr>
+          <w:sz w:val="25"/>
+          <w:szCs w:val="25"/>
+        </w:rPr>
+      </w:pPr>
+      <w:r>
+        <w:rPr>
+          <w:b/>
+          <w:bCs/>
+          <w:sz w:val="25"/>
+          <w:szCs w:val="25"/>
+        </w:rPr>
+        <w:t>Characteristics:</w:t>
+      </w:r>
+      <w:r>
+        <w:rPr>
+          <w:sz w:val="25"/>
+          <w:szCs w:val="25"/>
+        </w:rPr>
+        <w:t xml:space="preserve"> Uses neural networks to analyze defects, locate and classify individual parts, and read printed markings.</w:t>
+      </w:r>
+    </w:p>
+    <w:p>
+      <w:pPr>
+        <w:pStyle w:val="4"/>
+        <w:keepNext w:val="0"/>
+        <w:keepLines w:val="0"/>
+        <w:widowControl/>
+        <w:numPr>
+          <w:ilvl w:val="0"/>
+          <w:numId w:val="14"/>
+        </w:numPr>
+        <w:suppressLineNumbers w:val="0"/>
+        <w:tabs>
+          <w:tab w:val="clear" w:pos="420"/>
+        </w:tabs>
+        <w:ind w:left="800" w:leftChars="0" w:hanging="420" w:firstLineChars="0"/>
+        <w:jc w:val="both"/>
+        <w:rPr>
+          <w:sz w:val="25"/>
+          <w:szCs w:val="25"/>
+        </w:rPr>
+      </w:pPr>
+      <w:r>
+        <w:rPr>
+          <w:b/>
+          <w:bCs/>
+          <w:sz w:val="25"/>
+          <w:szCs w:val="25"/>
+        </w:rPr>
+        <w:t>How it Works:</w:t>
+      </w:r>
+      <w:r>
+        <w:rPr>
+          <w:sz w:val="25"/>
+          <w:szCs w:val="25"/>
+        </w:rPr>
+        <w:t xml:space="preserve"> Instead of manual programming, operators train the network using a batch of sample images of good parts. The system then learns to differentiate between good and defective items while accounting for expected variations.</w:t>
+      </w:r>
+    </w:p>
+    <w:p>
+      <w:pPr>
+        <w:pStyle w:val="4"/>
+        <w:keepNext w:val="0"/>
+        <w:keepLines w:val="0"/>
+        <w:widowControl/>
+        <w:numPr>
+          <w:ilvl w:val="0"/>
+          <w:numId w:val="14"/>
+        </w:numPr>
+        <w:suppressLineNumbers w:val="0"/>
+        <w:tabs>
+          <w:tab w:val="clear" w:pos="420"/>
+        </w:tabs>
+        <w:ind w:left="800" w:leftChars="0" w:hanging="420" w:firstLineChars="0"/>
+        <w:jc w:val="both"/>
+        <w:rPr>
+          <w:sz w:val="25"/>
+          <w:szCs w:val="25"/>
+        </w:rPr>
+      </w:pPr>
+      <w:r>
+        <w:rPr>
+          <w:b/>
+          <w:bCs/>
+          <w:sz w:val="25"/>
+          <w:szCs w:val="25"/>
+        </w:rPr>
+        <w:t>Key Advantages:</w:t>
+      </w:r>
+    </w:p>
+    <w:p>
+      <w:pPr>
+        <w:pStyle w:val="4"/>
+        <w:keepNext w:val="0"/>
+        <w:keepLines w:val="0"/>
+        <w:widowControl/>
+        <w:numPr>
+          <w:ilvl w:val="0"/>
+          <w:numId w:val="15"/>
+        </w:numPr>
+        <w:suppressLineNumbers w:val="0"/>
+        <w:tabs>
+          <w:tab w:val="clear" w:pos="420"/>
+        </w:tabs>
+        <w:ind w:left="1200" w:leftChars="0" w:hanging="420" w:firstLineChars="0"/>
+        <w:jc w:val="both"/>
+        <w:rPr>
+          <w:sz w:val="25"/>
+          <w:szCs w:val="25"/>
+        </w:rPr>
+      </w:pPr>
+      <w:r>
+        <w:rPr>
+          <w:sz w:val="25"/>
+          <w:szCs w:val="25"/>
+        </w:rPr>
+        <w:t>Easily retrained on a new target or product simply by providing a new set of reference images.</w:t>
+      </w:r>
+    </w:p>
+    <w:p>
+      <w:pPr>
+        <w:pStyle w:val="4"/>
+        <w:keepNext w:val="0"/>
+        <w:keepLines w:val="0"/>
+        <w:widowControl/>
+        <w:numPr>
+          <w:ilvl w:val="0"/>
+          <w:numId w:val="15"/>
+        </w:numPr>
+        <w:suppressLineNumbers w:val="0"/>
+        <w:tabs>
+          <w:tab w:val="clear" w:pos="420"/>
+        </w:tabs>
+        <w:ind w:left="1200" w:leftChars="0" w:hanging="420" w:firstLineChars="0"/>
+        <w:jc w:val="both"/>
+        <w:rPr>
+          <w:sz w:val="25"/>
+          <w:szCs w:val="25"/>
+        </w:rPr>
+      </w:pPr>
+      <w:r>
+        <w:rPr>
+          <w:sz w:val="25"/>
+          <w:szCs w:val="25"/>
+        </w:rPr>
+        <w:t>Handles tricky conditions like glare, varying orientations, or natural variations that traditional tools fail to locate reliably.</w:t>
+      </w:r>
+    </w:p>
+    <w:p>
+      <w:pPr>
+        <w:pStyle w:val="4"/>
+        <w:keepNext w:val="0"/>
+        <w:keepLines w:val="0"/>
+        <w:widowControl/>
+        <w:numPr>
+          <w:ilvl w:val="0"/>
+          <w:numId w:val="15"/>
+        </w:numPr>
+        <w:suppressLineNumbers w:val="0"/>
+        <w:tabs>
+          <w:tab w:val="clear" w:pos="420"/>
+        </w:tabs>
+        <w:ind w:left="1200" w:leftChars="0" w:hanging="420" w:firstLineChars="0"/>
+        <w:jc w:val="both"/>
+        <w:rPr>
+          <w:sz w:val="25"/>
+          <w:szCs w:val="25"/>
+        </w:rPr>
+      </w:pPr>
+      <w:r>
+        <w:rPr>
+          <w:sz w:val="25"/>
+          <w:szCs w:val="25"/>
+        </w:rPr>
+        <w:t>Effectively replaces tasks that were traditionally done manually (like final assembly checks) with greater consistency, reliability, and speed.</w:t>
+      </w:r>
+    </w:p>
+    <w:p>
+      <w:pPr>
+        <w:pStyle w:val="4"/>
+        <w:keepNext w:val="0"/>
+        <w:keepLines w:val="0"/>
+        <w:widowControl/>
+        <w:numPr>
+          <w:ilvl w:val="0"/>
+          <w:numId w:val="12"/>
+        </w:numPr>
+        <w:suppressLineNumbers w:val="0"/>
+        <w:ind w:left="420" w:leftChars="0" w:hanging="420" w:firstLineChars="0"/>
+        <w:rPr>
+          <w:b/>
+          <w:bCs/>
+          <w:sz w:val="28"/>
+          <w:szCs w:val="28"/>
+        </w:rPr>
+      </w:pPr>
+      <w:r>
+        <w:rPr>
+          <w:b/>
+          <w:bCs/>
+          <w:sz w:val="28"/>
+          <w:szCs w:val="28"/>
+        </w:rPr>
+        <w:t>Overall Conclusion:</w:t>
+      </w:r>
+    </w:p>
+    <w:p>
+      <w:pPr>
+        <w:pStyle w:val="4"/>
+        <w:keepNext w:val="0"/>
+        <w:keepLines w:val="0"/>
+        <w:widowControl/>
+        <w:numPr>
+          <w:ilvl w:val="0"/>
+          <w:numId w:val="16"/>
+        </w:numPr>
+        <w:suppressLineNumbers w:val="0"/>
+        <w:tabs>
+          <w:tab w:val="clear" w:pos="420"/>
+        </w:tabs>
+        <w:ind w:left="800" w:leftChars="0" w:hanging="420" w:firstLineChars="0"/>
+        <w:jc w:val="both"/>
+        <w:rPr>
+          <w:sz w:val="25"/>
+          <w:szCs w:val="25"/>
+        </w:rPr>
+      </w:pPr>
+      <w:r>
+        <w:rPr>
+          <w:sz w:val="25"/>
+          <w:szCs w:val="25"/>
+        </w:rPr>
+        <w:t>Both traditional machine vision and deep learning are crucial tools for factory automation.</w:t>
+      </w:r>
+    </w:p>
+    <w:p>
+      <w:pPr>
+        <w:pStyle w:val="4"/>
+        <w:keepNext w:val="0"/>
+        <w:keepLines w:val="0"/>
+        <w:widowControl/>
+        <w:numPr>
+          <w:ilvl w:val="0"/>
+          <w:numId w:val="16"/>
+        </w:numPr>
+        <w:suppressLineNumbers w:val="0"/>
+        <w:tabs>
+          <w:tab w:val="clear" w:pos="420"/>
+        </w:tabs>
+        <w:ind w:left="800" w:leftChars="0" w:hanging="420" w:firstLineChars="0"/>
+        <w:jc w:val="both"/>
+        <w:rPr>
+          <w:sz w:val="25"/>
+          <w:szCs w:val="25"/>
+        </w:rPr>
+      </w:pPr>
+      <w:r>
+        <w:rPr>
+          <w:sz w:val="25"/>
+          <w:szCs w:val="25"/>
+        </w:rPr>
+        <w:t>Traditional rule-based vision is ideal for straightforward, structured, and high-precision tasks, whereas deep learning serves as a game-changing option for complex scenarios requiring human-like vision coupled with computer speed and reliability.</w:t>
+      </w:r>
+    </w:p>
+    <w:p>
+      <w:pPr>
+        <w:pStyle w:val="4"/>
+        <w:keepNext w:val="0"/>
+        <w:keepLines w:val="0"/>
+        <w:widowControl/>
+        <w:numPr>
+          <w:numId w:val="0"/>
+        </w:numPr>
+        <w:suppressLineNumbers w:val="0"/>
+        <w:ind w:leftChars="0" w:right="0" w:rightChars="0"/>
+        <w:rPr>
+          <w:b/>
+          <w:bCs/>
+          <w:sz w:val="28"/>
+          <w:szCs w:val="28"/>
+        </w:rPr>
+      </w:pPr>
+    </w:p>
+    <w:p>
+      <w:pPr>
+        <w:rPr>
+          <w:rFonts w:hint="default" w:ascii="SimSun" w:hAnsi="SimSun" w:eastAsia="SimSun" w:cs="SimSun"/>
+          <w:sz w:val="24"/>
+          <w:szCs w:val="24"/>
+          <w:lang w:val="en-US"/>
+        </w:rPr>
+      </w:pPr>
+    </w:p>
     <w:sectPr>
-      <w:pgSz w:w="16838" w:h="11906" w:orient="landscape"/>
-      <w:pgMar w:top="1800" w:right="1440" w:bottom="1800" w:left="1440" w:header="720" w:footer="720" w:gutter="0"/>
+      <w:pgSz w:w="11906" w:h="16838"/>
+      <w:pgMar w:top="1440" w:right="1800" w:bottom="1440" w:left="1800" w:header="720" w:footer="720" w:gutter="0"/>
       <w:cols w:space="720" w:num="1"/>
       <w:docGrid w:linePitch="360" w:charSpace="0"/>
     </w:sectPr>
@@ -726,6 +1812,28 @@
 <file path=word/numbering.xml><?xml version="1.0" encoding="utf-8"?>
 <w:numbering xmlns:wpc="http://schemas.microsoft.com/office/word/2010/wordprocessingCanvas" xmlns:mc="http://schemas.openxmlformats.org/markup-compatibility/2006" xmlns:o="urn:schemas-microsoft-com:office:office" xmlns:r="http://schemas.openxmlformats.org/officeDocument/2006/relationships" xmlns:m="http://schemas.openxmlformats.org/officeDocument/2006/math" xmlns:v="urn:schemas-microsoft-com:vml" xmlns:wp14="http://schemas.microsoft.com/office/word/2010/wordprocessingDrawing" xmlns:wp="http://schemas.openxmlformats.org/drawingml/2006/wordprocessingDrawing" xmlns:w10="urn:schemas-microsoft-com:office:word" xmlns:w="http://schemas.openxmlformats.org/wordprocessingml/2006/main" xmlns:w14="http://schemas.microsoft.com/office/word/2010/wordml" xmlns:wpg="http://schemas.microsoft.com/office/word/2010/wordprocessingGroup" xmlns:wpi="http://schemas.microsoft.com/office/word/2010/wordprocessingInk" xmlns:wne="http://schemas.microsoft.com/office/word/2006/wordml" xmlns:wps="http://schemas.microsoft.com/office/word/2010/wordprocessingShape" xmlns:wpsCustomData="http://www.wps.cn/officeDocument/2013/wpsCustomData" mc:Ignorable="w14 wp14">
   <w:abstractNum w:abstractNumId="0">
+    <w:nsid w:val="8BEBD0DE"/>
+    <w:multiLevelType w:val="singleLevel"/>
+    <w:tmpl w:val="8BEBD0DE"/>
+    <w:lvl w:ilvl="0" w:tentative="0">
+      <w:start w:val="1"/>
+      <w:numFmt w:val="bullet"/>
+      <w:lvlText w:val=""/>
+      <w:lvlJc w:val="left"/>
+      <w:pPr>
+        <w:tabs>
+          <w:tab w:val="left" w:pos="420"/>
+        </w:tabs>
+        <w:ind w:left="420" w:leftChars="0" w:hanging="420" w:firstLineChars="0"/>
+      </w:pPr>
+      <w:rPr>
+        <w:rFonts w:hint="default" w:ascii="Wingdings" w:hAnsi="Wingdings"/>
+        <w:sz w:val="20"/>
+        <w:szCs w:val="20"/>
+      </w:rPr>
+    </w:lvl>
+  </w:abstractNum>
+  <w:abstractNum w:abstractNumId="1">
     <w:nsid w:val="9E8AAD0C"/>
     <w:multiLevelType w:val="singleLevel"/>
     <w:tmpl w:val="9E8AAD0C"/>
@@ -745,7 +1853,29 @@
       </w:rPr>
     </w:lvl>
   </w:abstractNum>
-  <w:abstractNum w:abstractNumId="1">
+  <w:abstractNum w:abstractNumId="2">
+    <w:nsid w:val="A2A1F8BE"/>
+    <w:multiLevelType w:val="singleLevel"/>
+    <w:tmpl w:val="A2A1F8BE"/>
+    <w:lvl w:ilvl="0" w:tentative="0">
+      <w:start w:val="1"/>
+      <w:numFmt w:val="bullet"/>
+      <w:lvlText w:val=""/>
+      <w:lvlJc w:val="left"/>
+      <w:pPr>
+        <w:tabs>
+          <w:tab w:val="left" w:pos="420"/>
+        </w:tabs>
+        <w:ind w:left="420" w:leftChars="0" w:hanging="420" w:firstLineChars="0"/>
+      </w:pPr>
+      <w:rPr>
+        <w:rFonts w:hint="default" w:ascii="Wingdings" w:hAnsi="Wingdings"/>
+        <w:sz w:val="20"/>
+        <w:szCs w:val="20"/>
+      </w:rPr>
+    </w:lvl>
+  </w:abstractNum>
+  <w:abstractNum w:abstractNumId="3">
     <w:nsid w:val="B68CC1CE"/>
     <w:multiLevelType w:val="singleLevel"/>
     <w:tmpl w:val="B68CC1CE"/>
@@ -767,7 +1897,7 @@
       </w:rPr>
     </w:lvl>
   </w:abstractNum>
-  <w:abstractNum w:abstractNumId="2">
+  <w:abstractNum w:abstractNumId="4">
     <w:nsid w:val="C18104C6"/>
     <w:multiLevelType w:val="singleLevel"/>
     <w:tmpl w:val="C18104C6"/>
@@ -787,7 +1917,7 @@
       </w:rPr>
     </w:lvl>
   </w:abstractNum>
-  <w:abstractNum w:abstractNumId="3">
+  <w:abstractNum w:abstractNumId="5">
     <w:nsid w:val="C3C98791"/>
     <w:multiLevelType w:val="singleLevel"/>
     <w:tmpl w:val="C3C98791"/>
@@ -807,7 +1937,29 @@
       </w:rPr>
     </w:lvl>
   </w:abstractNum>
-  <w:abstractNum w:abstractNumId="4">
+  <w:abstractNum w:abstractNumId="6">
+    <w:nsid w:val="CDC3C5B5"/>
+    <w:multiLevelType w:val="singleLevel"/>
+    <w:tmpl w:val="CDC3C5B5"/>
+    <w:lvl w:ilvl="0" w:tentative="0">
+      <w:start w:val="1"/>
+      <w:numFmt w:val="bullet"/>
+      <w:lvlText w:val=""/>
+      <w:lvlJc w:val="left"/>
+      <w:pPr>
+        <w:tabs>
+          <w:tab w:val="left" w:pos="420"/>
+        </w:tabs>
+        <w:ind w:left="420" w:leftChars="0" w:hanging="420" w:firstLineChars="0"/>
+      </w:pPr>
+      <w:rPr>
+        <w:rFonts w:hint="default" w:ascii="Wingdings" w:hAnsi="Wingdings"/>
+        <w:sz w:val="20"/>
+        <w:szCs w:val="20"/>
+      </w:rPr>
+    </w:lvl>
+  </w:abstractNum>
+  <w:abstractNum w:abstractNumId="7">
     <w:nsid w:val="D159A448"/>
     <w:multiLevelType w:val="singleLevel"/>
     <w:tmpl w:val="D159A448"/>
@@ -827,7 +1979,29 @@
       </w:rPr>
     </w:lvl>
   </w:abstractNum>
-  <w:abstractNum w:abstractNumId="5">
+  <w:abstractNum w:abstractNumId="8">
+    <w:nsid w:val="DAAB3487"/>
+    <w:multiLevelType w:val="singleLevel"/>
+    <w:tmpl w:val="DAAB3487"/>
+    <w:lvl w:ilvl="0" w:tentative="0">
+      <w:start w:val="1"/>
+      <w:numFmt w:val="bullet"/>
+      <w:lvlText w:val=""/>
+      <w:lvlJc w:val="left"/>
+      <w:pPr>
+        <w:tabs>
+          <w:tab w:val="left" w:pos="420"/>
+        </w:tabs>
+        <w:ind w:left="420" w:leftChars="0" w:hanging="420" w:firstLineChars="0"/>
+      </w:pPr>
+      <w:rPr>
+        <w:rFonts w:hint="default" w:ascii="Wingdings" w:hAnsi="Wingdings"/>
+        <w:sz w:val="20"/>
+        <w:szCs w:val="20"/>
+      </w:rPr>
+    </w:lvl>
+  </w:abstractNum>
+  <w:abstractNum w:abstractNumId="9">
     <w:nsid w:val="ECA0D1BD"/>
     <w:multiLevelType w:val="singleLevel"/>
     <w:tmpl w:val="ECA0D1BD"/>
@@ -847,23 +2021,185 @@
       </w:rPr>
     </w:lvl>
   </w:abstractNum>
+  <w:abstractNum w:abstractNumId="10">
+    <w:nsid w:val="04A7778C"/>
+    <w:multiLevelType w:val="singleLevel"/>
+    <w:tmpl w:val="04A7778C"/>
+    <w:lvl w:ilvl="0" w:tentative="0">
+      <w:start w:val="1"/>
+      <w:numFmt w:val="bullet"/>
+      <w:lvlText w:val=""/>
+      <w:lvlJc w:val="left"/>
+      <w:pPr>
+        <w:tabs>
+          <w:tab w:val="left" w:pos="420"/>
+        </w:tabs>
+        <w:ind w:left="420" w:leftChars="0" w:hanging="420" w:firstLineChars="0"/>
+      </w:pPr>
+      <w:rPr>
+        <w:rFonts w:hint="default" w:ascii="Wingdings" w:hAnsi="Wingdings"/>
+        <w:sz w:val="16"/>
+        <w:szCs w:val="16"/>
+      </w:rPr>
+    </w:lvl>
+  </w:abstractNum>
+  <w:abstractNum w:abstractNumId="11">
+    <w:nsid w:val="0933F89A"/>
+    <w:multiLevelType w:val="singleLevel"/>
+    <w:tmpl w:val="0933F89A"/>
+    <w:lvl w:ilvl="0" w:tentative="0">
+      <w:start w:val="1"/>
+      <w:numFmt w:val="decimal"/>
+      <w:lvlText w:val="%1."/>
+      <w:lvlJc w:val="left"/>
+      <w:pPr>
+        <w:tabs>
+          <w:tab w:val="left" w:pos="425"/>
+        </w:tabs>
+        <w:ind w:left="425" w:leftChars="0" w:hanging="425" w:firstLineChars="0"/>
+      </w:pPr>
+      <w:rPr>
+        <w:rFonts w:hint="default"/>
+        <w:sz w:val="20"/>
+        <w:szCs w:val="20"/>
+      </w:rPr>
+    </w:lvl>
+  </w:abstractNum>
+  <w:abstractNum w:abstractNumId="12">
+    <w:nsid w:val="118EE65D"/>
+    <w:multiLevelType w:val="singleLevel"/>
+    <w:tmpl w:val="118EE65D"/>
+    <w:lvl w:ilvl="0" w:tentative="0">
+      <w:start w:val="1"/>
+      <w:numFmt w:val="bullet"/>
+      <w:lvlText w:val=""/>
+      <w:lvlJc w:val="left"/>
+      <w:pPr>
+        <w:tabs>
+          <w:tab w:val="left" w:pos="420"/>
+        </w:tabs>
+        <w:ind w:left="420" w:leftChars="0" w:hanging="420" w:firstLineChars="0"/>
+      </w:pPr>
+      <w:rPr>
+        <w:rFonts w:hint="default" w:ascii="Wingdings" w:hAnsi="Wingdings"/>
+        <w:sz w:val="16"/>
+        <w:szCs w:val="16"/>
+      </w:rPr>
+    </w:lvl>
+  </w:abstractNum>
+  <w:abstractNum w:abstractNumId="13">
+    <w:nsid w:val="20199902"/>
+    <w:multiLevelType w:val="singleLevel"/>
+    <w:tmpl w:val="20199902"/>
+    <w:lvl w:ilvl="0" w:tentative="0">
+      <w:start w:val="1"/>
+      <w:numFmt w:val="bullet"/>
+      <w:lvlText w:val=""/>
+      <w:lvlJc w:val="left"/>
+      <w:pPr>
+        <w:tabs>
+          <w:tab w:val="left" w:pos="420"/>
+        </w:tabs>
+        <w:ind w:left="420" w:leftChars="0" w:hanging="420" w:firstLineChars="0"/>
+      </w:pPr>
+      <w:rPr>
+        <w:rFonts w:hint="default" w:ascii="Wingdings" w:hAnsi="Wingdings"/>
+        <w:sz w:val="20"/>
+        <w:szCs w:val="20"/>
+      </w:rPr>
+    </w:lvl>
+  </w:abstractNum>
+  <w:abstractNum w:abstractNumId="14">
+    <w:nsid w:val="5DDAD33B"/>
+    <w:multiLevelType w:val="singleLevel"/>
+    <w:tmpl w:val="5DDAD33B"/>
+    <w:lvl w:ilvl="0" w:tentative="0">
+      <w:start w:val="1"/>
+      <w:numFmt w:val="bullet"/>
+      <w:lvlText w:val=""/>
+      <w:lvlJc w:val="left"/>
+      <w:pPr>
+        <w:tabs>
+          <w:tab w:val="left" w:pos="420"/>
+        </w:tabs>
+        <w:ind w:left="420" w:leftChars="0" w:hanging="420" w:firstLineChars="0"/>
+      </w:pPr>
+      <w:rPr>
+        <w:rFonts w:hint="default" w:ascii="Wingdings" w:hAnsi="Wingdings"/>
+        <w:sz w:val="20"/>
+        <w:szCs w:val="20"/>
+      </w:rPr>
+    </w:lvl>
+  </w:abstractNum>
+  <w:abstractNum w:abstractNumId="15">
+    <w:nsid w:val="7490FB1B"/>
+    <w:multiLevelType w:val="singleLevel"/>
+    <w:tmpl w:val="7490FB1B"/>
+    <w:lvl w:ilvl="0" w:tentative="0">
+      <w:start w:val="1"/>
+      <w:numFmt w:val="bullet"/>
+      <w:lvlText w:val=""/>
+      <w:lvlJc w:val="left"/>
+      <w:pPr>
+        <w:tabs>
+          <w:tab w:val="left" w:pos="420"/>
+        </w:tabs>
+        <w:ind w:left="420" w:leftChars="0" w:hanging="420" w:firstLineChars="0"/>
+      </w:pPr>
+      <w:rPr>
+        <w:rFonts w:hint="default" w:ascii="Wingdings" w:hAnsi="Wingdings"/>
+        <w:sz w:val="20"/>
+        <w:szCs w:val="20"/>
+      </w:rPr>
+    </w:lvl>
+  </w:abstractNum>
   <w:num w:numId="1">
+    <w:abstractNumId w:val="3"/>
+  </w:num>
+  <w:num w:numId="2">
+    <w:abstractNumId w:val="7"/>
+  </w:num>
+  <w:num w:numId="3">
     <w:abstractNumId w:val="1"/>
   </w:num>
-  <w:num w:numId="2">
+  <w:num w:numId="4">
     <w:abstractNumId w:val="4"/>
   </w:num>
-  <w:num w:numId="3">
+  <w:num w:numId="5">
+    <w:abstractNumId w:val="9"/>
+  </w:num>
+  <w:num w:numId="6">
+    <w:abstractNumId w:val="5"/>
+  </w:num>
+  <w:num w:numId="7">
+    <w:abstractNumId w:val="10"/>
+  </w:num>
+  <w:num w:numId="8">
     <w:abstractNumId w:val="0"/>
   </w:num>
-  <w:num w:numId="4">
+  <w:num w:numId="9">
+    <w:abstractNumId w:val="11"/>
+  </w:num>
+  <w:num w:numId="10">
     <w:abstractNumId w:val="2"/>
   </w:num>
-  <w:num w:numId="5">
-    <w:abstractNumId w:val="5"/>
+  <w:num w:numId="11">
+    <w:abstractNumId w:val="6"/>
   </w:num>
-  <w:num w:numId="6">
-    <w:abstractNumId w:val="3"/>
+  <w:num w:numId="12">
+    <w:abstractNumId w:val="12"/>
+  </w:num>
+  <w:num w:numId="13">
+    <w:abstractNumId w:val="13"/>
+  </w:num>
+  <w:num w:numId="14">
+    <w:abstractNumId w:val="8"/>
+  </w:num>
+  <w:num w:numId="15">
+    <w:abstractNumId w:val="14"/>
+  </w:num>
+  <w:num w:numId="16">
+    <w:abstractNumId w:val="15"/>
   </w:num>
 </w:numbering>
 </file>
@@ -1166,6 +2502,7 @@
       <w:jc w:val="left"/>
     </w:pPr>
     <w:rPr>
+      <w:rFonts w:ascii="Times New Roman" w:hAnsi="Times New Roman" w:eastAsia="SimSun" w:cs="Times New Roman"/>
       <w:kern w:val="0"/>
       <w:sz w:val="24"/>
       <w:szCs w:val="24"/>

</xml_diff>